<commit_message>
update links in docs
</commit_message>
<xml_diff>
--- a/docs/Experiment-building/index.docx
+++ b/docs/Experiment-building/index.docx
@@ -39,19 +39,69 @@
         <w:pStyle w:val="FirstParagraph"/>
       </w:pPr>
       <w:r>
-        <w:t>This section is structured into three parts. First, it will provide an overview of the paradigm difference in experimental design, contrasting it with traditional neuroscience experiments. Second, it will provide an overview of game engine concepts that are relevant for building experiments. Finally, it will describe some specific tools that we have developed for these experiments in the hopes that they will be reusable for you. We write this article presuming that the user has some topic or scientific question in mind to study, and is now looking at the implementation.</w:t>
+        <w:t xml:space="preserve">This section </w:t>
+      </w:r>
+      <w:r>
+        <w:t xml:space="preserve">provides a conceptual overview of game engines for fMRI experiments, and </w:t>
+      </w:r>
+      <w:r>
+        <w:t>is structured into three parts. First, it will provide an overview of the paradigm difference in experimental design, contrasting it with traditional neuroscience experiments. Second, it will provide an overview of game engine concepts that are relevant for building experiments. Finally, it</w:t>
+      </w:r>
+      <w:r>
+        <w:t xml:space="preserve"> will provide some software engineering considerations. </w:t>
+      </w:r>
+    </w:p>
+    <w:p>
+      <w:pPr>
+        <w:pStyle w:val="FirstParagraph"/>
+      </w:pPr>
+      <w:r>
+        <w:t xml:space="preserve">The </w:t>
+      </w:r>
+      <w:hyperlink r:id="rId8" w:history="1">
+        <w:r>
+          <w:rPr>
+            <w:rStyle w:val="Hyperlink"/>
+          </w:rPr>
+          <w:t xml:space="preserve">Tools </w:t>
+        </w:r>
+      </w:hyperlink>
+      <w:r>
+        <w:t>section</w:t>
+      </w:r>
+      <w:r>
+        <w:t xml:space="preserve"> will</w:t>
+      </w:r>
+      <w:r>
+        <w:t xml:space="preserve"> the</w:t>
+      </w:r>
+      <w:r>
+        <w:t>n</w:t>
+      </w:r>
+      <w:r>
+        <w:t xml:space="preserve"> describe some specific </w:t>
+      </w:r>
+      <w:r>
+        <w:t>implementations of these concepts</w:t>
+      </w:r>
+      <w:r>
+        <w:t xml:space="preserve"> in the hopes that they will be reusable for you. We write this article presuming that the user has some topic or scientific question in mind to study, and is now looking at the implementation.</w:t>
       </w:r>
     </w:p>
     <w:bookmarkStart w:id="1" w:name="X4a937c4c5fcde352093ffbf6632d10c0fdf5c8f"/>
     <w:p>
       <w:pPr>
-        <w:pStyle w:val="Heading4"/>
+        <w:pStyle w:val="ListParagraph"/>
+        <w:numPr>
+          <w:ilvl w:val="0"/>
+          <w:numId w:val="2"/>
+        </w:numPr>
       </w:pPr>
       <w:r>
         <w:fldChar w:fldCharType="begin"/>
       </w:r>
       <w:r>
-        <w:instrText xml:space="preserve">HYPERLINK "Experiment-Concepts.md" \h </w:instrText>
+        <w:instrText>HYPERLINK "Experiment-Concepts"</w:instrText>
       </w:r>
       <w:r>
         <w:fldChar w:fldCharType="separate"/>
@@ -70,13 +120,17 @@
     <w:bookmarkEnd w:id="1"/>
     <w:p>
       <w:pPr>
-        <w:pStyle w:val="Heading4"/>
+        <w:pStyle w:val="ListParagraph"/>
+        <w:numPr>
+          <w:ilvl w:val="0"/>
+          <w:numId w:val="2"/>
+        </w:numPr>
       </w:pPr>
       <w:r>
         <w:fldChar w:fldCharType="begin"/>
       </w:r>
       <w:r>
-        <w:instrText xml:space="preserve">HYPERLINK "game-design.md" \h </w:instrText>
+        <w:instrText>HYPERLINK "game-design"</w:instrText>
       </w:r>
       <w:r>
         <w:fldChar w:fldCharType="separate"/>
@@ -87,14 +141,34 @@
         </w:rPr>
         <w:t>Game engine concepts for experiments</w:t>
       </w:r>
-      <w:r>
-        <w:fldChar w:fldCharType="end"/>
-      </w:r>
       <w:bookmarkEnd w:id="0"/>
       <w:bookmarkEnd w:id="2"/>
       <w:r>
+        <w:rPr>
+          <w:rStyle w:val="Hyperlink"/>
+        </w:rPr>
         <w:t xml:space="preserve"> </w:t>
       </w:r>
+      <w:r>
+        <w:fldChar w:fldCharType="end"/>
+      </w:r>
+    </w:p>
+    <w:p>
+      <w:pPr>
+        <w:pStyle w:val="ListParagraph"/>
+        <w:numPr>
+          <w:ilvl w:val="0"/>
+          <w:numId w:val="2"/>
+        </w:numPr>
+      </w:pPr>
+      <w:hyperlink r:id="rId9" w:history="1">
+        <w:r>
+          <w:rPr>
+            <w:rStyle w:val="Hyperlink"/>
+          </w:rPr>
+          <w:t>Software engineering concerns</w:t>
+        </w:r>
+      </w:hyperlink>
     </w:p>
     <w:sectPr>
       <w:pgSz w:w="12240" w:h="15840"/>
@@ -229,8 +303,123 @@
       </w:pPr>
     </w:lvl>
   </w:abstractNum>
+  <w:abstractNum w:abstractNumId="1" w15:restartNumberingAfterBreak="0">
+    <w:nsid w:val="598F07E7"/>
+    <w:multiLevelType w:val="hybridMultilevel"/>
+    <w:tmpl w:val="585A118A"/>
+    <w:lvl w:ilvl="0" w:tplc="5924173A">
+      <w:numFmt w:val="bullet"/>
+      <w:lvlText w:val="-"/>
+      <w:lvlJc w:val="left"/>
+      <w:pPr>
+        <w:ind w:left="720" w:hanging="360"/>
+      </w:pPr>
+      <w:rPr>
+        <w:rFonts w:ascii="Cambria" w:eastAsiaTheme="minorHAnsi" w:hAnsi="Cambria" w:cstheme="minorBidi" w:hint="default"/>
+      </w:rPr>
+    </w:lvl>
+    <w:lvl w:ilvl="1" w:tplc="04090003" w:tentative="1">
+      <w:start w:val="1"/>
+      <w:numFmt w:val="bullet"/>
+      <w:lvlText w:val="o"/>
+      <w:lvlJc w:val="left"/>
+      <w:pPr>
+        <w:ind w:left="1440" w:hanging="360"/>
+      </w:pPr>
+      <w:rPr>
+        <w:rFonts w:ascii="Courier New" w:hAnsi="Courier New" w:cs="Courier New" w:hint="default"/>
+      </w:rPr>
+    </w:lvl>
+    <w:lvl w:ilvl="2" w:tplc="04090005" w:tentative="1">
+      <w:start w:val="1"/>
+      <w:numFmt w:val="bullet"/>
+      <w:lvlText w:val=""/>
+      <w:lvlJc w:val="left"/>
+      <w:pPr>
+        <w:ind w:left="2160" w:hanging="360"/>
+      </w:pPr>
+      <w:rPr>
+        <w:rFonts w:ascii="Wingdings" w:hAnsi="Wingdings" w:hint="default"/>
+      </w:rPr>
+    </w:lvl>
+    <w:lvl w:ilvl="3" w:tplc="04090001" w:tentative="1">
+      <w:start w:val="1"/>
+      <w:numFmt w:val="bullet"/>
+      <w:lvlText w:val=""/>
+      <w:lvlJc w:val="left"/>
+      <w:pPr>
+        <w:ind w:left="2880" w:hanging="360"/>
+      </w:pPr>
+      <w:rPr>
+        <w:rFonts w:ascii="Symbol" w:hAnsi="Symbol" w:hint="default"/>
+      </w:rPr>
+    </w:lvl>
+    <w:lvl w:ilvl="4" w:tplc="04090003" w:tentative="1">
+      <w:start w:val="1"/>
+      <w:numFmt w:val="bullet"/>
+      <w:lvlText w:val="o"/>
+      <w:lvlJc w:val="left"/>
+      <w:pPr>
+        <w:ind w:left="3600" w:hanging="360"/>
+      </w:pPr>
+      <w:rPr>
+        <w:rFonts w:ascii="Courier New" w:hAnsi="Courier New" w:cs="Courier New" w:hint="default"/>
+      </w:rPr>
+    </w:lvl>
+    <w:lvl w:ilvl="5" w:tplc="04090005" w:tentative="1">
+      <w:start w:val="1"/>
+      <w:numFmt w:val="bullet"/>
+      <w:lvlText w:val=""/>
+      <w:lvlJc w:val="left"/>
+      <w:pPr>
+        <w:ind w:left="4320" w:hanging="360"/>
+      </w:pPr>
+      <w:rPr>
+        <w:rFonts w:ascii="Wingdings" w:hAnsi="Wingdings" w:hint="default"/>
+      </w:rPr>
+    </w:lvl>
+    <w:lvl w:ilvl="6" w:tplc="04090001" w:tentative="1">
+      <w:start w:val="1"/>
+      <w:numFmt w:val="bullet"/>
+      <w:lvlText w:val=""/>
+      <w:lvlJc w:val="left"/>
+      <w:pPr>
+        <w:ind w:left="5040" w:hanging="360"/>
+      </w:pPr>
+      <w:rPr>
+        <w:rFonts w:ascii="Symbol" w:hAnsi="Symbol" w:hint="default"/>
+      </w:rPr>
+    </w:lvl>
+    <w:lvl w:ilvl="7" w:tplc="04090003" w:tentative="1">
+      <w:start w:val="1"/>
+      <w:numFmt w:val="bullet"/>
+      <w:lvlText w:val="o"/>
+      <w:lvlJc w:val="left"/>
+      <w:pPr>
+        <w:ind w:left="5760" w:hanging="360"/>
+      </w:pPr>
+      <w:rPr>
+        <w:rFonts w:ascii="Courier New" w:hAnsi="Courier New" w:cs="Courier New" w:hint="default"/>
+      </w:rPr>
+    </w:lvl>
+    <w:lvl w:ilvl="8" w:tplc="04090005" w:tentative="1">
+      <w:start w:val="1"/>
+      <w:numFmt w:val="bullet"/>
+      <w:lvlText w:val=""/>
+      <w:lvlJc w:val="left"/>
+      <w:pPr>
+        <w:ind w:left="6480" w:hanging="360"/>
+      </w:pPr>
+      <w:rPr>
+        <w:rFonts w:ascii="Wingdings" w:hAnsi="Wingdings" w:hint="default"/>
+      </w:rPr>
+    </w:lvl>
+  </w:abstractNum>
   <w:num w:numId="1" w16cid:durableId="57829379">
     <w:abstractNumId w:val="0"/>
+  </w:num>
+  <w:num w:numId="2" w16cid:durableId="127819966">
+    <w:abstractNumId w:val="1"/>
   </w:num>
 </w:numbering>
 </file>
@@ -1259,6 +1448,27 @@
       <w:rFonts w:ascii="Consolas" w:hAnsi="Consolas"/>
       <w:sz w:val="22"/>
     </w:rPr>
+  </w:style>
+  <w:style w:type="character" w:styleId="UnresolvedMention">
+    <w:name w:val="Unresolved Mention"/>
+    <w:basedOn w:val="DefaultParagraphFont"/>
+    <w:uiPriority w:val="99"/>
+    <w:semiHidden/>
+    <w:unhideWhenUsed/>
+    <w:rsid w:val="00FF6715"/>
+    <w:rPr>
+      <w:color w:val="605E5C"/>
+      <w:shd w:val="clear" w:color="auto" w:fill="E1DFDD"/>
+    </w:rPr>
+  </w:style>
+  <w:style w:type="paragraph" w:styleId="ListParagraph">
+    <w:name w:val="List Paragraph"/>
+    <w:basedOn w:val="Normal"/>
+    <w:rsid w:val="00A842F8"/>
+    <w:pPr>
+      <w:ind w:left="720"/>
+      <w:contextualSpacing/>
+    </w:pPr>
   </w:style>
 </w:styles>
 </file>

</xml_diff>